<commit_message>
Updated Power Bi Dashboard
</commit_message>
<xml_diff>
--- a/Dashboards Screenshots.docx
+++ b/Dashboards Screenshots.docx
@@ -2,12 +2,20 @@
 <file path=word/document.xml><?xml version="1.0" encoding="utf-8"?>
 <w:document xmlns:wpc="http://schemas.microsoft.com/office/word/2010/wordprocessingCanvas" xmlns:cx="http://schemas.microsoft.com/office/drawing/2014/chartex" xmlns:mc="http://schemas.openxmlformats.org/markup-compatibility/2006" xmlns:o="urn:schemas-microsoft-com:office:office" xmlns:r="http://schemas.openxmlformats.org/officeDocument/2006/relationships" xmlns:m="http://schemas.openxmlformats.org/officeDocument/2006/math" xmlns:v="urn:schemas-microsoft-com:vml" xmlns:wp14="http://schemas.microsoft.com/office/word/2010/wordprocessingDrawing" xmlns:wp="http://schemas.openxmlformats.org/drawingml/2006/wordprocessingDrawing" xmlns:w10="urn:schemas-microsoft-com:office:word" xmlns:w="http://schemas.openxmlformats.org/wordprocessingml/2006/main" xmlns:w14="http://schemas.microsoft.com/office/word/2010/wordml" xmlns:w15="http://schemas.microsoft.com/office/word/2012/wordml" xmlns:w16se="http://schemas.microsoft.com/office/word/2015/wordml/symex" xmlns:wpg="http://schemas.microsoft.com/office/word/2010/wordprocessingGroup" xmlns:wpi="http://schemas.microsoft.com/office/word/2010/wordprocessingInk" xmlns:wne="http://schemas.microsoft.com/office/word/2006/wordml" xmlns:wps="http://schemas.microsoft.com/office/word/2010/wordprocessingShape" mc:Ignorable="w14 w15 w16se wp14">
   <w:body>
+    <w:p/>
+    <w:p/>
+    <w:p/>
+    <w:p/>
+    <w:p/>
     <w:p>
       <w:r>
+        <w:rPr>
+          <w:noProof/>
+        </w:rPr>
         <w:drawing>
-          <wp:inline distT="0" distB="0" distL="0" distR="0" wp14:anchorId="473CD000" wp14:editId="1F83DB03">
-            <wp:extent cx="6226175" cy="3409950"/>
-            <wp:effectExtent l="0" t="0" r="3175" b="0"/>
+          <wp:inline distT="0" distB="0" distL="0" distR="0" wp14:anchorId="0D1256BA" wp14:editId="61A5BD21">
+            <wp:extent cx="5733415" cy="3237865"/>
+            <wp:effectExtent l="0" t="0" r="635" b="635"/>
             <wp:docPr id="1" name="Picture 1"/>
             <wp:cNvGraphicFramePr>
               <a:graphicFrameLocks xmlns:a="http://schemas.openxmlformats.org/drawingml/2006/main" noChangeAspect="1"/>
@@ -28,7 +36,7 @@
                   <pic:spPr>
                     <a:xfrm>
                       <a:off x="0" y="0"/>
-                      <a:ext cx="6234041" cy="3414258"/>
+                      <a:ext cx="5733415" cy="3237865"/>
                     </a:xfrm>
                     <a:prstGeom prst="rect">
                       <a:avLst/>
@@ -45,11 +53,14 @@
     <w:p/>
     <w:p>
       <w:r>
+        <w:rPr>
+          <w:noProof/>
+        </w:rPr>
         <w:drawing>
-          <wp:inline distT="0" distB="0" distL="0" distR="0" wp14:anchorId="64F8FA7D" wp14:editId="777A473D">
-            <wp:extent cx="6221095" cy="4229100"/>
-            <wp:effectExtent l="0" t="0" r="8255" b="0"/>
-            <wp:docPr id="2" name="Picture 2"/>
+          <wp:inline distT="0" distB="0" distL="0" distR="0" wp14:anchorId="1DD4E097" wp14:editId="043530A8">
+            <wp:extent cx="5733415" cy="3237865"/>
+            <wp:effectExtent l="0" t="0" r="635" b="635"/>
+            <wp:docPr id="4" name="Picture 4"/>
             <wp:cNvGraphicFramePr>
               <a:graphicFrameLocks xmlns:a="http://schemas.openxmlformats.org/drawingml/2006/main" noChangeAspect="1"/>
             </wp:cNvGraphicFramePr>
@@ -69,7 +80,7 @@
                   <pic:spPr>
                     <a:xfrm>
                       <a:off x="0" y="0"/>
-                      <a:ext cx="6248096" cy="4247455"/>
+                      <a:ext cx="5733415" cy="3237865"/>
                     </a:xfrm>
                     <a:prstGeom prst="rect">
                       <a:avLst/>
@@ -83,15 +94,18 @@
       </w:r>
     </w:p>
     <w:p/>
+    <w:p/>
     <w:p>
-      <w:bookmarkStart w:id="0" w:name="_GoBack"/>
       <w:r>
+        <w:rPr>
+          <w:noProof/>
+        </w:rPr>
         <w:lastRenderedPageBreak/>
         <w:drawing>
-          <wp:inline distT="0" distB="0" distL="0" distR="0" wp14:anchorId="6C0C5B4B" wp14:editId="3396A7A7">
-            <wp:extent cx="6245860" cy="3971925"/>
-            <wp:effectExtent l="0" t="0" r="2540" b="9525"/>
-            <wp:docPr id="3" name="Picture 3"/>
+          <wp:inline distT="0" distB="0" distL="0" distR="0" wp14:anchorId="296BA9D0" wp14:editId="30930ED7">
+            <wp:extent cx="5733415" cy="3237865"/>
+            <wp:effectExtent l="0" t="0" r="635" b="635"/>
+            <wp:docPr id="5" name="Picture 5"/>
             <wp:cNvGraphicFramePr>
               <a:graphicFrameLocks xmlns:a="http://schemas.openxmlformats.org/drawingml/2006/main" noChangeAspect="1"/>
             </wp:cNvGraphicFramePr>
@@ -111,7 +125,7 @@
                   <pic:spPr>
                     <a:xfrm>
                       <a:off x="0" y="0"/>
-                      <a:ext cx="6278895" cy="3992933"/>
+                      <a:ext cx="5733415" cy="3237865"/>
                     </a:xfrm>
                     <a:prstGeom prst="rect">
                       <a:avLst/>
@@ -123,6 +137,7 @@
           </wp:inline>
         </w:drawing>
       </w:r>
+      <w:bookmarkStart w:id="0" w:name="_GoBack"/>
       <w:bookmarkEnd w:id="0"/>
     </w:p>
     <w:sectPr>

</xml_diff>